<commit_message>
fix(backend): update requirements for python 3.14 and configure pyre2 paths
</commit_message>
<xml_diff>
--- a/PILi_Quarts_V4.0_Studio/backend/modules/N04_Binary_Factory/output_sandbox/STUDIO_COTIZACION_SIMPLE.docx
+++ b/PILi_Quarts_V4.0_Studio/backend/modules/N04_Binary_Factory/output_sandbox/STUDIO_COTIZACION_SIMPLE.docx
@@ -197,7 +197,7 @@
       <w:r>
         <w:rPr>
           <w:b/>
-          <w:color w:val="A855F7"/>
+          <w:color w:val="22C55E"/>
           <w:sz w:val="56"/>
         </w:rPr>
         <w:t>COTIZACIÓN DE SERVICIOS</w:t>
@@ -210,7 +210,7 @@
       <w:r>
         <w:rPr>
           <w:b/>
-          <w:color w:val="7E22CE"/>
+          <w:color w:val="15803D"/>
           <w:sz w:val="32"/>
         </w:rPr>
         <w:t>N° DOC-Studio_User-1</w:t>
@@ -231,16 +231,16 @@
         <w:tc>
           <w:tcPr>
             <w:tcW w:type="dxa" w:w="4320"/>
-            <w:top w:sz="12" w:val="single" w:color="A855F7"/>
-            <w:left w:sz="12" w:val="single" w:color="A855F7"/>
-            <w:bottom w:sz="12" w:val="single" w:color="A855F7"/>
-            <w:right w:sz="12" w:val="single" w:color="A855F7"/>
+            <w:top w:sz="12" w:val="single" w:color="22C55E"/>
+            <w:left w:sz="12" w:val="single" w:color="22C55E"/>
+            <w:bottom w:sz="12" w:val="single" w:color="22C55E"/>
+            <w:right w:sz="12" w:val="single" w:color="22C55E"/>
           </w:tcPr>
           <w:p>
             <w:r>
               <w:rPr>
                 <w:b/>
-                <w:color w:val="A855F7"/>
+                <w:color w:val="22C55E"/>
                 <w:sz w:val="22"/>
               </w:rPr>
               <w:t>DATOS DEL CLIENTE</w:t>
@@ -274,16 +274,16 @@
         <w:tc>
           <w:tcPr>
             <w:tcW w:type="dxa" w:w="4320"/>
-            <w:top w:sz="12" w:val="single" w:color="A855F7"/>
-            <w:left w:sz="12" w:val="single" w:color="A855F7"/>
-            <w:bottom w:sz="12" w:val="single" w:color="A855F7"/>
-            <w:right w:sz="12" w:val="single" w:color="A855F7"/>
+            <w:top w:sz="12" w:val="single" w:color="22C55E"/>
+            <w:left w:sz="12" w:val="single" w:color="22C55E"/>
+            <w:bottom w:sz="12" w:val="single" w:color="22C55E"/>
+            <w:right w:sz="12" w:val="single" w:color="22C55E"/>
           </w:tcPr>
           <w:p>
             <w:r>
               <w:rPr>
                 <w:b/>
-                <w:color w:val="A855F7"/>
+                <w:color w:val="22C55E"/>
                 <w:sz w:val="22"/>
               </w:rPr>
               <w:t>DATOS DE LA COTIZACIÓN</w:t>
@@ -321,7 +321,7 @@
       <w:r>
         <w:rPr>
           <w:b/>
-          <w:color w:val="A855F7"/>
+          <w:color w:val="22C55E"/>
           <w:sz w:val="28"/>
         </w:rPr>
         <w:t>Detalle de la Cotización</w:t>
@@ -390,11 +390,11 @@
         <w:tc>
           <w:tcPr>
             <w:tcW w:type="dxa" w:w="4320"/>
-            <w:shd w:fill="A855F7"/>
-            <w:top w:sz="8" w:val="single" w:color="A855F7"/>
-            <w:left w:sz="8" w:val="single" w:color="A855F7"/>
-            <w:bottom w:sz="8" w:val="single" w:color="A855F7"/>
-            <w:right w:sz="8" w:val="single" w:color="A855F7"/>
+            <w:shd w:fill="22C55E"/>
+            <w:top w:sz="8" w:val="single" w:color="22C55E"/>
+            <w:left w:sz="8" w:val="single" w:color="22C55E"/>
+            <w:bottom w:sz="8" w:val="single" w:color="22C55E"/>
+            <w:right w:sz="8" w:val="single" w:color="22C55E"/>
           </w:tcPr>
           <w:p>
             <w:r>
@@ -410,11 +410,11 @@
         <w:tc>
           <w:tcPr>
             <w:tcW w:type="dxa" w:w="4320"/>
-            <w:shd w:fill="A855F7"/>
-            <w:top w:sz="8" w:val="single" w:color="A855F7"/>
-            <w:left w:sz="8" w:val="single" w:color="A855F7"/>
-            <w:bottom w:sz="8" w:val="single" w:color="A855F7"/>
-            <w:right w:sz="8" w:val="single" w:color="A855F7"/>
+            <w:shd w:fill="22C55E"/>
+            <w:top w:sz="8" w:val="single" w:color="22C55E"/>
+            <w:left w:sz="8" w:val="single" w:color="22C55E"/>
+            <w:bottom w:sz="8" w:val="single" w:color="22C55E"/>
+            <w:right w:sz="8" w:val="single" w:color="22C55E"/>
           </w:tcPr>
           <w:p>
             <w:r>
@@ -434,7 +434,7 @@
       <w:r>
         <w:rPr>
           <w:b/>
-          <w:color w:val="A855F7"/>
+          <w:color w:val="22C55E"/>
           <w:sz w:val="24"/>
         </w:rPr>
         <w:t>Observaciones Técnicas</w:t>

</xml_diff>